<commit_message>
Remove category from product workflow
</commit_message>
<xml_diff>
--- a/docs/Admin_User_SOP.docx
+++ b/docs/Admin_User_SOP.docx
@@ -1664,14 +1664,6 @@
         <w:pStyle w:val="ListBullet"/>
       </w:pPr>
       <w:r>
-        <w:t>Category</w:t>
-      </w:r>
-    </w:p>
-    <w:p>
-      <w:pPr>
-        <w:pStyle w:val="ListBullet"/>
-      </w:pPr>
-      <w:r>
         <w:t>Store Name</w:t>
       </w:r>
     </w:p>

</xml_diff>